<commit_message>
feat: enhance bidiVisual fixture with styles.xml for accurate Word comparison
</commit_message>
<xml_diff>
--- a/test-files/bidi-visual-table.docx
+++ b/test-files/bidi-visual-table.docx
@@ -13,7 +13,6 @@
     <w:tbl>
       <w:tblPr>
         <w:tblW w:w="6000" w:type="dxa"/>
-        <w:tblLayout w:type="fixed"/>
         <w:tblBorders>
           <w:top w:val="single" w:sz="8" w:space="0" w:color="808080"/>
           <w:bottom w:val="single" w:sz="8" w:space="0" w:color="808080"/>
@@ -22,6 +21,13 @@
           <w:left w:val="nil"/>
           <w:right w:val="nil"/>
         </w:tblBorders>
+        <w:tblLayout w:type="fixed"/>
+        <w:tblCellMar>
+          <w:top w:w="0" w:type="dxa"/>
+          <w:left w:w="108" w:type="dxa"/>
+          <w:bottom w:w="0" w:type="dxa"/>
+          <w:right w:w="108" w:type="dxa"/>
+        </w:tblCellMar>
       </w:tblPr>
       <w:tblGrid>
         <w:gridCol w:w="1000"/>
@@ -255,8 +261,8 @@
     </w:p>
     <w:tbl>
       <w:tblPr>
+        <w:bidiVisual/>
         <w:tblW w:w="6000" w:type="dxa"/>
-        <w:tblLayout w:type="fixed"/>
         <w:tblBorders>
           <w:top w:val="single" w:sz="8" w:space="0" w:color="808080"/>
           <w:bottom w:val="single" w:sz="8" w:space="0" w:color="808080"/>
@@ -265,7 +271,13 @@
           <w:left w:val="nil"/>
           <w:right w:val="nil"/>
         </w:tblBorders>
-        <w:bidiVisual/>
+        <w:tblLayout w:type="fixed"/>
+        <w:tblCellMar>
+          <w:top w:w="0" w:type="dxa"/>
+          <w:left w:w="108" w:type="dxa"/>
+          <w:bottom w:w="0" w:type="dxa"/>
+          <w:right w:w="108" w:type="dxa"/>
+        </w:tblCellMar>
       </w:tblPr>
       <w:tblGrid>
         <w:gridCol w:w="1000"/>
@@ -494,4 +506,28 @@
     </w:sectPr>
   </w:body>
 </w:document>
+</file>
+
+<file path=word/styles.xml><?xml version="1.0" encoding="utf-8"?>
+<w:styles xmlns:w="http://schemas.openxmlformats.org/wordprocessingml/2006/main">
+  <w:docDefaults>
+    <w:rPrDefault>
+      <w:rPr>
+        <w:rFonts w:ascii="Times New Roman" w:hAnsi="Times New Roman" w:eastAsia="Times New Roman" w:cs="Times New Roman"/>
+        <w:kern w:val="2"/>
+        <w:sz w:val="20"/>
+        <w:szCs w:val="20"/>
+      </w:rPr>
+    </w:rPrDefault>
+    <w:pPrDefault>
+      <w:pPr>
+        <w:spacing w:before="0" w:after="0" w:line="240" w:lineRule="auto"/>
+      </w:pPr>
+    </w:pPrDefault>
+  </w:docDefaults>
+  <w:style w:type="paragraph" w:default="1" w:styleId="Normal">
+    <w:name w:val="Normal"/>
+    <w:qFormat/>
+  </w:style>
+</w:styles>
 </file>
</xml_diff>